<commit_message>
Lafond Parte 2: revisão
Co-Authored-By: Claude Opus 5.5 <noreply@anthropic.com>
Claude-Session: https://claude.ai/code/session_01MJjUEEZrxQDEUifKK2vj9g
</commit_message>
<xml_diff>
--- a/roteiros/jorge-lafond/Lafond_Parte2.docx
+++ b/roteiros/jorge-lafond/Lafond_Parte2.docx
@@ -15,7 +15,15 @@
         <w:rPr>
           <w:color w:val="000000"/>
         </w:rPr>
-        <w:t>Antes de virar a Vera Verão, Jorge Lafond passou quase vinte anos no fundo da cena.</w:t>
+        <w:t>A peruca ainda ia demorar quase vinte anos para chegar.</w:t>
+      </w:r>
+    </w:p>
+    <w:p>
+      <w:r>
+        <w:rPr>
+          <w:color w:val="000000"/>
+        </w:rPr>
+        <w:t>Até lá, Jorge Lafond viveu no fundo da cena.</w:t>
       </w:r>
     </w:p>
     <w:p>
@@ -55,15 +63,7 @@
         <w:rPr>
           <w:color w:val="000000"/>
         </w:rPr>
-        <w:t>Nos anos seguintes, apareceu no cinema, em filmes como Bar Esperança e Bete Balanço. Quase sempre em papéis pequenos. Às vezes, uma única cena.</w:t>
-      </w:r>
-    </w:p>
-    <w:p>
-      <w:r>
-        <w:rPr>
-          <w:color w:val="000000"/>
-        </w:rPr>
-        <w:t>Em mil novecentos e oitenta e três, virou um bailarino espacial no especial infantil Plunct Plact Zuuum.</w:t>
+        <w:t>Nos anos seguintes, apareceu em filmes como Bar Esperança e Bete Balanço. Quase sempre em papéis pequenos. Às vezes, uma única cena.</w:t>
       </w:r>
     </w:p>
     <w:p>
@@ -135,7 +135,7 @@
         <w:rPr>
           <w:color w:val="000000"/>
         </w:rPr>
-        <w:t>Ele carregava as duas desde os seis anos de idade.</w:t>
+        <w:t>Uma delas, ele escondia desde os seis anos de idade.</w:t>
       </w:r>
     </w:p>
     <w:p>
@@ -223,7 +223,7 @@
         <w:rPr>
           <w:color w:val="000000"/>
         </w:rPr>
-        <w:t>Com um metro e noventa e três de altura e uma peruca na cabeça, ele criou a Vera Lúcia Verão.</w:t>
+        <w:t>Com um metro e noventa e três de altura, ele vestiu uma peruca e criou a Vera Lúcia Verão.</w:t>
       </w:r>
     </w:p>
     <w:p>
@@ -335,22 +335,6 @@
         <w:rPr>
           <w:color w:val="000000"/>
         </w:rPr>
-        <w:t>Para muita gente, aquilo era coragem.</w:t>
-      </w:r>
-    </w:p>
-    <w:p>
-      <w:r>
-        <w:rPr>
-          <w:color w:val="000000"/>
-        </w:rPr>
-        <w:t>Para outros, era só mais um motivo de piada.</w:t>
-      </w:r>
-    </w:p>
-    <w:p>
-      <w:r>
-        <w:rPr>
-          <w:color w:val="000000"/>
-        </w:rPr>
         <w:t>Havia o Brasil que ria junto com ele. E havia o Brasil que ria dele.</w:t>
       </w:r>
     </w:p>
@@ -431,7 +415,7 @@
         <w:rPr>
           <w:color w:val="000000"/>
         </w:rPr>
-        <w:t>No Carnaval do Rio, desfilava com fantasias que davam o que falar. Nas ruas, era parado o tempo todo.</w:t>
+        <w:t>No Carnaval do Rio, desfilava com fantasias que davam o que falar.</w:t>
       </w:r>
     </w:p>
     <w:p>

</xml_diff>